<commit_message>
2.7: karbon iskeleti kartlari baski boyutunda (3 sutun) yeniden cizildi
</commit_message>
<xml_diff>
--- a/Kim12-2-7-Alifatik-Hidrokarbonlarda-Izomerlik.docx
+++ b/Kim12-2-7-Alifatik-Hidrokarbonlarda-Izomerlik.docx
@@ -566,7 +566,7 @@
       <w:r>
         <w:drawing>
           <wp:inline distT="0" distB="0" distL="0" distR="0">
-            <wp:extent cx="5940000" cy="2415884"/>
+            <wp:extent cx="5651003" cy="2987045"/>
             <wp:docPr id="900001" name="Grafik 900001" descr="Alifatik hidrokarbon kanıt kartları"/>
             <wp:cNvGraphicFramePr>
               <a:graphicFrameLocks noChangeAspect="1"/>
@@ -587,7 +587,7 @@
                   <pic:spPr>
                     <a:xfrm>
                       <a:off x="0" y="0"/>
-                      <a:ext cx="5940000" cy="2415884"/>
+                      <a:ext cx="5651003" cy="2987045"/>
                     </a:xfrm>
                     <a:prstGeom prst="rect">
                       <a:avLst/>

</xml_diff>

<commit_message>
Kim12-2-7-Alifatik-Hidrokarbonlarda-Izomerlik: gorsel alanlarina Shutter onizlemeleri yerlestirildi (2.3 bicimi)
</commit_message>
<xml_diff>
--- a/Kim12-2-7-Alifatik-Hidrokarbonlarda-Izomerlik.docx
+++ b/Kim12-2-7-Alifatik-Hidrokarbonlarda-Izomerlik.docx
@@ -69,85 +69,59 @@
         <w:t xml:space="preserve">’dur; ancak bütan yaklaşık −0,5 °C’de, izobütan ise yaklaşık −11,7 °C’de kaynar. Benzer bir durum petrolden elde edilen birçok yakıt bileşeninde de görülür: Aynı sayıda karbon ve hidrojen atomu içeren moleküllerin bazıları motorlarda vuruntu yaparken bazıları daha düzgün yanar. Peki atom türü ve sayısı aynı olan iki molekül nasıl farklı özellikler gösterebilir? Bu moleküllerin yapıları hangi yönlerden birbirinden ayrılır? Bu farklılıklar hangi ölçütlere göre gruplandırılabilir?</w:t>
       </w:r>
     </w:p>
-    <w:tbl>
-      <w:tblPr>
-        <w:tblW w:w="9000" w:type="dxa"/>
+    <w:p>
+      <w:pPr>
         <w:jc w:val="center"/>
-        <w:tblBorders>
-          <w:top w:val="single" w:sz="8" w:space="0" w:color="7F7F7F"/>
-          <w:left w:val="single" w:sz="8" w:space="0" w:color="7F7F7F"/>
-          <w:bottom w:val="single" w:sz="8" w:space="0" w:color="7F7F7F"/>
-          <w:right w:val="single" w:sz="8" w:space="0" w:color="7F7F7F"/>
-        </w:tblBorders>
-      </w:tblPr>
-      <w:tblGrid>
-        <w:gridCol w:w="9000"/>
-      </w:tblGrid>
-      <w:tr>
-        <w:tc>
-          <w:tcPr>
-            <w:tcW w:w="9000" w:type="dxa"/>
-            <w:shd w:val="clear" w:color="auto" w:fill="EDEDED"/>
-          </w:tcPr>
-          <w:p>
-            <w:pPr>
-              <w:jc w:val="both"/>
-              <w:rPr>
-                <w:rFonts w:ascii="Times New Roman" w:hAnsi="Times New Roman" w:cs="Times New Roman"/>
-                <w:lang w:val="tr-TR"/>
-              </w:rPr>
-            </w:pPr>
-            <w:r>
-              <w:rPr>
-                <w:rFonts w:ascii="Times New Roman" w:hAnsi="Times New Roman" w:cs="Times New Roman"/>
-                <w:lang w:val="tr-TR"/>
-              </w:rPr>
-              <w:t xml:space="preserve">GÖRSEL ALANI (Shutterstock)</w:t>
-            </w:r>
-          </w:p>
-          <w:p>
-            <w:pPr>
-              <w:jc w:val="both"/>
-              <w:rPr>
-                <w:rFonts w:ascii="Times New Roman" w:hAnsi="Times New Roman" w:cs="Times New Roman"/>
-                <w:lang w:val="tr-TR"/>
-              </w:rPr>
-            </w:pPr>
-            <w:r>
-              <w:rPr>
-                <w:rFonts w:ascii="Times New Roman" w:hAnsi="Times New Roman" w:cs="Times New Roman"/>
-                <w:lang w:val="tr-TR"/>
-              </w:rPr>
-              <w:t xml:space="preserve">Tarif: Doğada bir kamp ocağına takılı küçük gaz kartuşu ve üzerinde mavi alev; marka ve logo görünmesin.</w:t>
-            </w:r>
-          </w:p>
-          <w:p>
-            <w:pPr>
-              <w:jc w:val="both"/>
-              <w:rPr>
-                <w:rFonts w:ascii="Times New Roman" w:hAnsi="Times New Roman" w:cs="Times New Roman"/>
-                <w:lang w:val="tr-TR"/>
-              </w:rPr>
-            </w:pPr>
-            <w:r>
-              <w:rPr>
-                <w:rFonts w:ascii="Times New Roman" w:hAnsi="Times New Roman" w:cs="Times New Roman"/>
-                <w:lang w:val="tr-TR"/>
-              </w:rPr>
-              <w:t xml:space="preserve">Shutter ID: 2246359657 (fotoğraf) — Camping gas stove on white background</w:t>
-            </w:r>
-          </w:p>
-        </w:tc>
-      </w:tr>
-    </w:tbl>
+      </w:pPr>
+      <w:r>
+        <w:drawing>
+          <wp:inline xmlns:a="http://schemas.openxmlformats.org/drawingml/2006/main" xmlns:pic="http://schemas.openxmlformats.org/drawingml/2006/picture">
+            <wp:extent cx="3289817" cy="2520000"/>
+            <wp:docPr id="900014" name="Picture 900014"/>
+            <wp:cNvGraphicFramePr>
+              <a:graphicFrameLocks noChangeAspect="1"/>
+            </wp:cNvGraphicFramePr>
+            <a:graphic>
+              <a:graphicData uri="http://schemas.openxmlformats.org/drawingml/2006/picture">
+                <pic:pic>
+                  <pic:nvPicPr>
+                    <pic:cNvPr id="0" name="2246359657_d.jpg"/>
+                    <pic:cNvPicPr/>
+                  </pic:nvPicPr>
+                  <pic:blipFill>
+                    <a:blip r:embed="rId11"/>
+                    <a:stretch>
+                      <a:fillRect/>
+                    </a:stretch>
+                  </pic:blipFill>
+                  <pic:spPr>
+                    <a:xfrm>
+                      <a:off x="0" y="0"/>
+                      <a:ext cx="3289817" cy="2520000"/>
+                    </a:xfrm>
+                    <a:prstGeom prst="rect"/>
+                  </pic:spPr>
+                </pic:pic>
+              </a:graphicData>
+            </a:graphic>
+          </wp:inline>
+        </w:drawing>
+      </w:r>
+    </w:p>
     <w:p>
       <w:pPr>
-        <w:jc w:val="both"/>
-        <w:rPr>
-          <w:rFonts w:ascii="Times New Roman" w:hAnsi="Times New Roman" w:cs="Times New Roman"/>
-          <w:lang w:val="tr-TR"/>
-        </w:rPr>
-      </w:pPr>
+        <w:jc w:val="center"/>
+      </w:pPr>
+      <w:r>
+        <w:rPr>
+          <w:rFonts w:ascii="Times New Roman" w:hAnsi="Times New Roman" w:cs="Times New Roman"/>
+          <w:b/>
+          <w:bCs/>
+          <w:highlight w:val="yellow"/>
+          <w:lang w:val="tr-TR"/>
+        </w:rPr>
+        <w:t xml:space="preserve">Shutter id: 2246359657</w:t>
+      </w:r>
     </w:p>
     <w:p>
       <w:pPr>

</xml_diff>